<commit_message>
customer part added by 23-52227-2
</commit_message>
<xml_diff>
--- a/CO4-Template.docx
+++ b/CO4-Template.docx
@@ -325,8 +325,6 @@
               </w:rPr>
               <w:t>1</w:t>
             </w:r>
-            <w:bookmarkStart w:id="0" w:name="_GoBack"/>
-            <w:bookmarkEnd w:id="0"/>
             <w:r>
               <w:rPr>
                 <w:b/>
@@ -881,6 +879,7 @@
       <w:pPr>
         <w:jc w:val="center"/>
       </w:pPr>
+      <w:bookmarkStart w:id="0" w:name="_GoBack"/>
       <w:r>
         <w:rPr>
           <w:noProof/>
@@ -888,9 +887,9 @@
         </w:rPr>
         <w:drawing>
           <wp:inline distT="0" distB="0" distL="0" distR="0">
-            <wp:extent cx="8543533" cy="6205223"/>
-            <wp:effectExtent l="0" t="0" r="0" b="5080"/>
-            <wp:docPr id="3" name="Picture 3"/>
+            <wp:extent cx="12677775" cy="6428542"/>
+            <wp:effectExtent l="0" t="0" r="0" b="0"/>
+            <wp:docPr id="1" name="Picture 1"/>
             <wp:cNvGraphicFramePr>
               <a:graphicFrameLocks xmlns:a="http://schemas.openxmlformats.org/drawingml/2006/main" noChangeAspect="1"/>
             </wp:cNvGraphicFramePr>
@@ -898,7 +897,7 @@
               <a:graphicData uri="http://schemas.openxmlformats.org/drawingml/2006/picture">
                 <pic:pic xmlns:pic="http://schemas.openxmlformats.org/drawingml/2006/picture">
                   <pic:nvPicPr>
-                    <pic:cNvPr id="3" name="Screenshot 2026-09-11 160816.png"/>
+                    <pic:cNvPr id="1" name="Screenshot 2026-09-13 193828.png"/>
                     <pic:cNvPicPr/>
                   </pic:nvPicPr>
                   <pic:blipFill>
@@ -916,7 +915,7 @@
                   <pic:spPr>
                     <a:xfrm>
                       <a:off x="0" y="0"/>
-                      <a:ext cx="8571294" cy="6225386"/>
+                      <a:ext cx="12696766" cy="6438172"/>
                     </a:xfrm>
                     <a:prstGeom prst="rect">
                       <a:avLst/>
@@ -928,6 +927,7 @@
           </wp:inline>
         </w:drawing>
       </w:r>
+      <w:bookmarkEnd w:id="0"/>
     </w:p>
     <w:sectPr>
       <w:pgSz w:w="12240" w:h="15840"/>
@@ -12880,6 +12880,26 @@
 </file>
 
 <file path=customXml/item1.xml><?xml version="1.0" encoding="utf-8"?>
+<p:properties xmlns:p="http://schemas.microsoft.com/office/2006/metadata/properties" xmlns:xsi="http://www.w3.org/2001/XMLSchema-instance" xmlns:pc="http://schemas.microsoft.com/office/infopath/2007/PartnerControls">
+  <documentManagement>
+    <lcf76f155ced4ddcb4097134ff3c332f xmlns="f1d0a431-73d2-4aed-a3b9-997dc2ad4fd8">
+      <Terms xmlns="http://schemas.microsoft.com/office/infopath/2007/PartnerControls"/>
+    </lcf76f155ced4ddcb4097134ff3c332f>
+    <TaxCatchAll xmlns="37e66944-e397-4f75-8f63-20bc0a6f2fd7" xsi:nil="true"/>
+  </documentManagement>
+</p:properties>
+</file>
+
+<file path=customXml/item2.xml><?xml version="1.0" encoding="utf-8"?>
+<?mso-contentType ?>
+<FormTemplates xmlns="http://schemas.microsoft.com/sharepoint/v3/contenttype/forms">
+  <Display>DocumentLibraryForm</Display>
+  <Edit>DocumentLibraryForm</Edit>
+  <New>DocumentLibraryForm</New>
+</FormTemplates>
+</file>
+
+<file path=customXml/item3.xml><?xml version="1.0" encoding="utf-8"?>
 <ct:contentTypeSchema xmlns:ct="http://schemas.microsoft.com/office/2006/metadata/contentType" xmlns:ma="http://schemas.microsoft.com/office/2006/metadata/properties/metaAttributes" ct:_="" ma:_="" ma:contentTypeName="Document" ma:contentTypeID="0x0101001B2BCDF1B2A22B4A8146FD01CC9FC177" ma:contentTypeVersion="10" ma:contentTypeDescription="Create a new document." ma:contentTypeScope="" ma:versionID="3e525043451833587e6b7d2d2ec3d492">
   <xsd:schema xmlns:xsd="http://www.w3.org/2001/XMLSchema" xmlns:xs="http://www.w3.org/2001/XMLSchema" xmlns:p="http://schemas.microsoft.com/office/2006/metadata/properties" xmlns:ns2="f1d0a431-73d2-4aed-a3b9-997dc2ad4fd8" xmlns:ns3="37e66944-e397-4f75-8f63-20bc0a6f2fd7" targetNamespace="http://schemas.microsoft.com/office/2006/metadata/properties" ma:root="true" ma:fieldsID="b36973d3bbbd2a2a9841aa468cc8a2bb" ns2:_="" ns3:_="">
     <xsd:import namespace="f1d0a431-73d2-4aed-a3b9-997dc2ad4fd8"/>
@@ -13068,31 +13088,30 @@
 </ct:contentTypeSchema>
 </file>
 
-<file path=customXml/item2.xml><?xml version="1.0" encoding="utf-8"?>
-<?mso-contentType ?>
-<FormTemplates xmlns="http://schemas.microsoft.com/sharepoint/v3/contenttype/forms">
-  <Display>DocumentLibraryForm</Display>
-  <Edit>DocumentLibraryForm</Edit>
-  <New>DocumentLibraryForm</New>
-</FormTemplates>
-</file>
-
-<file path=customXml/item3.xml><?xml version="1.0" encoding="utf-8"?>
-<p:properties xmlns:p="http://schemas.microsoft.com/office/2006/metadata/properties" xmlns:xsi="http://www.w3.org/2001/XMLSchema-instance" xmlns:pc="http://schemas.microsoft.com/office/infopath/2007/PartnerControls">
-  <documentManagement>
-    <lcf76f155ced4ddcb4097134ff3c332f xmlns="f1d0a431-73d2-4aed-a3b9-997dc2ad4fd8">
-      <Terms xmlns="http://schemas.microsoft.com/office/infopath/2007/PartnerControls"/>
-    </lcf76f155ced4ddcb4097134ff3c332f>
-    <TaxCatchAll xmlns="37e66944-e397-4f75-8f63-20bc0a6f2fd7" xsi:nil="true"/>
-  </documentManagement>
-</p:properties>
-</file>
-
 <file path=customXml/item4.xml><?xml version="1.0" encoding="utf-8"?>
 <b:Sources xmlns:b="http://schemas.openxmlformats.org/officeDocument/2006/bibliography" xmlns="http://schemas.openxmlformats.org/officeDocument/2006/bibliography" SelectedStyle="/APA.XSL" StyleName="APA"/>
 </file>
 
 <file path=customXml/itemProps1.xml><?xml version="1.0" encoding="utf-8"?>
+<ds:datastoreItem xmlns:ds="http://schemas.openxmlformats.org/officeDocument/2006/customXml" ds:itemID="{BDFBAE8B-8A43-41D2-9F3E-B8CF45EDFD2F}">
+  <ds:schemaRefs>
+    <ds:schemaRef ds:uri="http://schemas.microsoft.com/office/2006/metadata/properties"/>
+    <ds:schemaRef ds:uri="http://schemas.microsoft.com/office/infopath/2007/PartnerControls"/>
+    <ds:schemaRef ds:uri="f1d0a431-73d2-4aed-a3b9-997dc2ad4fd8"/>
+    <ds:schemaRef ds:uri="37e66944-e397-4f75-8f63-20bc0a6f2fd7"/>
+  </ds:schemaRefs>
+</ds:datastoreItem>
+</file>
+
+<file path=customXml/itemProps2.xml><?xml version="1.0" encoding="utf-8"?>
+<ds:datastoreItem xmlns:ds="http://schemas.openxmlformats.org/officeDocument/2006/customXml" ds:itemID="{EF906749-D2B3-4825-A561-E9A7D8D96A19}">
+  <ds:schemaRefs>
+    <ds:schemaRef ds:uri="http://schemas.microsoft.com/sharepoint/v3/contenttype/forms"/>
+  </ds:schemaRefs>
+</ds:datastoreItem>
+</file>
+
+<file path=customXml/itemProps3.xml><?xml version="1.0" encoding="utf-8"?>
 <ds:datastoreItem xmlns:ds="http://schemas.openxmlformats.org/officeDocument/2006/customXml" ds:itemID="{DF53E376-3202-4FA5-A1AB-B5646CB551FE}">
   <ds:schemaRefs>
     <ds:schemaRef ds:uri="http://schemas.microsoft.com/office/2006/metadata/contentType"/>
@@ -13111,27 +13130,8 @@
 </ds:datastoreItem>
 </file>
 
-<file path=customXml/itemProps2.xml><?xml version="1.0" encoding="utf-8"?>
-<ds:datastoreItem xmlns:ds="http://schemas.openxmlformats.org/officeDocument/2006/customXml" ds:itemID="{EF906749-D2B3-4825-A561-E9A7D8D96A19}">
-  <ds:schemaRefs>
-    <ds:schemaRef ds:uri="http://schemas.microsoft.com/sharepoint/v3/contenttype/forms"/>
-  </ds:schemaRefs>
-</ds:datastoreItem>
-</file>
-
-<file path=customXml/itemProps3.xml><?xml version="1.0" encoding="utf-8"?>
-<ds:datastoreItem xmlns:ds="http://schemas.openxmlformats.org/officeDocument/2006/customXml" ds:itemID="{BDFBAE8B-8A43-41D2-9F3E-B8CF45EDFD2F}">
-  <ds:schemaRefs>
-    <ds:schemaRef ds:uri="http://schemas.microsoft.com/office/2006/metadata/properties"/>
-    <ds:schemaRef ds:uri="http://schemas.microsoft.com/office/infopath/2007/PartnerControls"/>
-    <ds:schemaRef ds:uri="f1d0a431-73d2-4aed-a3b9-997dc2ad4fd8"/>
-    <ds:schemaRef ds:uri="37e66944-e397-4f75-8f63-20bc0a6f2fd7"/>
-  </ds:schemaRefs>
-</ds:datastoreItem>
-</file>
-
 <file path=customXml/itemProps4.xml><?xml version="1.0" encoding="utf-8"?>
-<ds:datastoreItem xmlns:ds="http://schemas.openxmlformats.org/officeDocument/2006/customXml" ds:itemID="{57420543-9034-43F7-B73E-867CFCC1A316}">
+<ds:datastoreItem xmlns:ds="http://schemas.openxmlformats.org/officeDocument/2006/customXml" ds:itemID="{9B7969F4-CDCF-4750-9029-2E24670348B6}">
   <ds:schemaRefs>
     <ds:schemaRef ds:uri="http://schemas.openxmlformats.org/officeDocument/2006/bibliography"/>
   </ds:schemaRefs>

</xml_diff>